<commit_message>
Update final submission links and exports
</commit_message>
<xml_diff>
--- a/docs/DFWIT_Final_Submission_PDF.docx
+++ b/docs/DFWIT_Final_Submission_PDF.docx
@@ -79,7 +79,7 @@
         <w:br/>
       </w:r>
       <w:r>
-        <w:t xml:space="preserve">Pending final recording upload; add the public or judge-accessible URL before portal submission.</w:t>
+        <w:t xml:space="preserve">https://drive.google.com/file/d/1x1MZUvCIXHdJ_M4LhPHl15NzQOj-0nVI/view</w:t>
       </w:r>
     </w:p>
     <w:p>
@@ -97,13 +97,39 @@
         <w:t xml:space="preserve"> </w:t>
       </w:r>
       <w:r>
-        <w:t xml:space="preserve">July 11, 2026</w:t>
+        <w:t xml:space="preserve">July 12, 2026</w:t>
       </w:r>
     </w:p>
     <w:bookmarkEnd w:id="9"/>
     <w:bookmarkEnd w:id="10"/>
     <w:bookmarkEnd w:id="11"/>
-    <w:bookmarkStart w:id="12" w:name="the-problem-fragmented-oncology-data"/>
+    <w:bookmarkStart w:id="12" w:name="executive-summary"/>
+    <w:p>
+      <w:pPr>
+        <w:pStyle w:val="Heading1"/>
+      </w:pPr>
+      <w:r>
+        <w:t xml:space="preserve">Executive Summary</w:t>
+      </w:r>
+    </w:p>
+    <w:p>
+      <w:pPr>
+        <w:pStyle w:val="FirstParagraph"/>
+      </w:pPr>
+      <w:r>
+        <w:t xml:space="preserve">OncoReconcile AI is a human-governed AI platform that transforms fragmented oncology terminology into governed, explainable, interoperable, and AI-ready data assets. The platform reconciles inconsistent disease names, gene symbols, and genomic variants through deterministic normalization, evidence-supported reconciliation, confidence scoring, provenance tracking, and human governance workflows.</w:t>
+      </w:r>
+    </w:p>
+    <w:p>
+      <w:pPr>
+        <w:pStyle w:val="BodyText"/>
+      </w:pPr>
+      <w:r>
+        <w:t xml:space="preserve">Rather than replacing expert curators, OncoReconcile AI accelerates oncology data harmonization while preserving transparency, auditability, and human oversight.</w:t>
+      </w:r>
+    </w:p>
+    <w:bookmarkEnd w:id="12"/>
+    <w:bookmarkStart w:id="13" w:name="the-problem-fragmented-oncology-data"/>
     <w:p>
       <w:pPr>
         <w:pStyle w:val="Heading1"/>
@@ -379,8 +405,8 @@
         <w:t xml:space="preserve">OncoReconcile AI is a governed data-quality layer that converts fragmented oncology data into standardized, explainable, reviewable, and reusable information — before it reaches analytics, AI, or interoperability pipelines.</w:t>
       </w:r>
     </w:p>
-    <w:bookmarkEnd w:id="12"/>
-    <w:bookmarkStart w:id="16" w:name="the-product"/>
+    <w:bookmarkEnd w:id="13"/>
+    <w:bookmarkStart w:id="17" w:name="the-product"/>
     <w:p>
       <w:pPr>
         <w:pStyle w:val="Heading1"/>
@@ -669,18 +695,18 @@
           <wp:inline>
             <wp:extent cx="5334000" cy="3704166"/>
             <wp:effectExtent b="0" l="0" r="0" t="0"/>
-            <wp:docPr descr="Platform homepage" title="" id="14" name="Picture"/>
+            <wp:docPr descr="Platform homepage" title="" id="15" name="Picture"/>
             <a:graphic>
               <a:graphicData uri="http://schemas.openxmlformats.org/drawingml/2006/picture">
                 <pic:pic>
                   <pic:nvPicPr>
-                    <pic:cNvPr descr="screenshots/01-homepage.png" id="15" name="Picture"/>
+                    <pic:cNvPr descr="screenshots/01-homepage.png" id="16" name="Picture"/>
                     <pic:cNvPicPr>
                       <a:picLocks noChangeArrowheads="1" noChangeAspect="1"/>
                     </pic:cNvPicPr>
                   </pic:nvPicPr>
                   <pic:blipFill>
-                    <a:blip r:embed="rId13"/>
+                    <a:blip r:embed="rId14"/>
                     <a:stretch>
                       <a:fillRect/>
                     </a:stretch>
@@ -715,8 +741,8 @@
         <w:t xml:space="preserve">Platform homepage</w:t>
       </w:r>
     </w:p>
-    <w:bookmarkEnd w:id="16"/>
-    <w:bookmarkStart w:id="20" w:name="working-reconciliation-evidence"/>
+    <w:bookmarkEnd w:id="17"/>
+    <w:bookmarkStart w:id="21" w:name="working-reconciliation-evidence"/>
     <w:p>
       <w:pPr>
         <w:pStyle w:val="Heading1"/>
@@ -826,18 +852,18 @@
           <wp:inline>
             <wp:extent cx="5334000" cy="3704166"/>
             <wp:effectExtent b="0" l="0" r="0" t="0"/>
-            <wp:docPr descr="High-confidence reconciliation with evidence" title="" id="18" name="Picture"/>
+            <wp:docPr descr="High-confidence reconciliation with evidence" title="" id="19" name="Picture"/>
             <a:graphic>
               <a:graphicData uri="http://schemas.openxmlformats.org/drawingml/2006/picture">
                 <pic:pic>
                   <pic:nvPicPr>
-                    <pic:cNvPr descr="screenshots/02-single-record-reconciliation.png" id="19" name="Picture"/>
+                    <pic:cNvPr descr="screenshots/02-single-record-reconciliation.png" id="20" name="Picture"/>
                     <pic:cNvPicPr>
                       <a:picLocks noChangeArrowheads="1" noChangeAspect="1"/>
                     </pic:cNvPicPr>
                   </pic:nvPicPr>
                   <pic:blipFill>
-                    <a:blip r:embed="rId17"/>
+                    <a:blip r:embed="rId18"/>
                     <a:stretch>
                       <a:fillRect/>
                     </a:stretch>
@@ -872,8 +898,8 @@
         <w:t xml:space="preserve">High-confidence reconciliation with evidence</w:t>
       </w:r>
     </w:p>
-    <w:bookmarkEnd w:id="20"/>
-    <w:bookmarkStart w:id="27" w:name="human-governed-ai"/>
+    <w:bookmarkEnd w:id="21"/>
+    <w:bookmarkStart w:id="28" w:name="human-governed-ai"/>
     <w:p>
       <w:pPr>
         <w:pStyle w:val="Heading1"/>
@@ -1027,18 +1053,18 @@
           <wp:inline>
             <wp:extent cx="5334000" cy="3704166"/>
             <wp:effectExtent b="0" l="0" r="0" t="0"/>
-            <wp:docPr descr="Ambiguous case routed to human review" title="" id="22" name="Picture"/>
+            <wp:docPr descr="Ambiguous case routed to human review" title="" id="23" name="Picture"/>
             <a:graphic>
               <a:graphicData uri="http://schemas.openxmlformats.org/drawingml/2006/picture">
                 <pic:pic>
                   <pic:nvPicPr>
-                    <pic:cNvPr descr="screenshots/03-review-required.png" id="23" name="Picture"/>
+                    <pic:cNvPr descr="screenshots/03-review-required.png" id="24" name="Picture"/>
                     <pic:cNvPicPr>
                       <a:picLocks noChangeArrowheads="1" noChangeAspect="1"/>
                     </pic:cNvPicPr>
                   </pic:nvPicPr>
                   <pic:blipFill>
-                    <a:blip r:embed="rId21"/>
+                    <a:blip r:embed="rId22"/>
                     <a:stretch>
                       <a:fillRect/>
                     </a:stretch>
@@ -1082,18 +1108,18 @@
           <wp:inline>
             <wp:extent cx="5334000" cy="3704166"/>
             <wp:effectExtent b="0" l="0" r="0" t="0"/>
-            <wp:docPr descr="Review queue and curator workflow" title="" id="25" name="Picture"/>
+            <wp:docPr descr="Review queue and curator workflow" title="" id="26" name="Picture"/>
             <a:graphic>
               <a:graphicData uri="http://schemas.openxmlformats.org/drawingml/2006/picture">
                 <pic:pic>
                   <pic:nvPicPr>
-                    <pic:cNvPr descr="screenshots/04-review-queue.png" id="26" name="Picture"/>
+                    <pic:cNvPr descr="screenshots/04-review-queue.png" id="27" name="Picture"/>
                     <pic:cNvPicPr>
                       <a:picLocks noChangeArrowheads="1" noChangeAspect="1"/>
                     </pic:cNvPicPr>
                   </pic:nvPicPr>
                   <pic:blipFill>
-                    <a:blip r:embed="rId24"/>
+                    <a:blip r:embed="rId25"/>
                     <a:stretch>
                       <a:fillRect/>
                     </a:stretch>
@@ -1128,8 +1154,8 @@
         <w:t xml:space="preserve">Review queue and curator workflow</w:t>
       </w:r>
     </w:p>
-    <w:bookmarkEnd w:id="27"/>
-    <w:bookmarkStart w:id="28" w:name="enterprise-patient-journey"/>
+    <w:bookmarkEnd w:id="28"/>
+    <w:bookmarkStart w:id="29" w:name="enterprise-patient-journey"/>
     <w:p>
       <w:pPr>
         <w:pStyle w:val="Heading1"/>
@@ -1155,7 +1181,7 @@
         </w:numPr>
       </w:pPr>
       <w:r>
-        <w:t xml:space="preserve">15 synthetic oncology patients;</w:t>
+        <w:t xml:space="preserve">18 synthetic oncology patients;</w:t>
       </w:r>
     </w:p>
     <w:p>
@@ -1214,8 +1240,8 @@
         <w:t xml:space="preserve">All patient journey data is synthetic and used only for product demonstration.</w:t>
       </w:r>
     </w:p>
-    <w:bookmarkEnd w:id="28"/>
-    <w:bookmarkStart w:id="29" w:name="semantic-harmonization"/>
+    <w:bookmarkEnd w:id="29"/>
+    <w:bookmarkStart w:id="30" w:name="semantic-harmonization"/>
     <w:p>
       <w:pPr>
         <w:pStyle w:val="Heading1"/>
@@ -1414,8 +1440,8 @@
         <w:t xml:space="preserve">Mappings retain source, confidence, and review status. These are prototype mappings, not a complete certified terminology service.</w:t>
       </w:r>
     </w:p>
-    <w:bookmarkEnd w:id="29"/>
-    <w:bookmarkStart w:id="36" w:name="interoperability"/>
+    <w:bookmarkEnd w:id="30"/>
+    <w:bookmarkStart w:id="37" w:name="interoperability"/>
     <w:p>
       <w:pPr>
         <w:pStyle w:val="Heading1"/>
@@ -1451,7 +1477,7 @@
         <w:t xml:space="preserve"> </w:t>
       </w:r>
       <w:r>
-        <w:t xml:space="preserve">Patient, Condition, Observation, MedicationStatement, Procedure, and Provenance resources;</w:t>
+        <w:t xml:space="preserve">Patient, Condition, Observation, MedicationStatement, and Provenance resources;</w:t>
       </w:r>
     </w:p>
     <w:p>
@@ -1473,7 +1499,7 @@
         <w:t xml:space="preserve"> </w:t>
       </w:r>
       <w:r>
-        <w:t xml:space="preserve">condition occurrence, measurement, observation, drug exposure, and procedure occurrence records;</w:t>
+        <w:t xml:space="preserve">condition occurrence, measurement, observation, and drug exposure records;</w:t>
       </w:r>
     </w:p>
     <w:p>
@@ -1529,18 +1555,18 @@
           <wp:inline>
             <wp:extent cx="5334000" cy="3704166"/>
             <wp:effectExtent b="0" l="0" r="0" t="0"/>
-            <wp:docPr descr="Knowledge graph export" title="" id="31" name="Picture"/>
+            <wp:docPr descr="Knowledge graph export" title="" id="32" name="Picture"/>
             <a:graphic>
               <a:graphicData uri="http://schemas.openxmlformats.org/drawingml/2006/picture">
                 <pic:pic>
                   <pic:nvPicPr>
-                    <pic:cNvPr descr="screenshots/06-knowledge-graph-export.png" id="32" name="Picture"/>
+                    <pic:cNvPr descr="screenshots/06-knowledge-graph-export.png" id="33" name="Picture"/>
                     <pic:cNvPicPr>
                       <a:picLocks noChangeArrowheads="1" noChangeAspect="1"/>
                     </pic:cNvPicPr>
                   </pic:nvPicPr>
                   <pic:blipFill>
-                    <a:blip r:embed="rId30"/>
+                    <a:blip r:embed="rId31"/>
                     <a:stretch>
                       <a:fillRect/>
                     </a:stretch>
@@ -1584,18 +1610,18 @@
           <wp:inline>
             <wp:extent cx="5334000" cy="3704166"/>
             <wp:effectExtent b="0" l="0" r="0" t="0"/>
-            <wp:docPr descr="Interactive API documentation" title="" id="34" name="Picture"/>
+            <wp:docPr descr="Interactive API documentation" title="" id="35" name="Picture"/>
             <a:graphic>
               <a:graphicData uri="http://schemas.openxmlformats.org/drawingml/2006/picture">
                 <pic:pic>
                   <pic:nvPicPr>
-                    <pic:cNvPr descr="screenshots/07-api-docs.png" id="35" name="Picture"/>
+                    <pic:cNvPr descr="screenshots/07-api-docs.png" id="36" name="Picture"/>
                     <pic:cNvPicPr>
                       <a:picLocks noChangeArrowheads="1" noChangeAspect="1"/>
                     </pic:cNvPicPr>
                   </pic:nvPicPr>
                   <pic:blipFill>
-                    <a:blip r:embed="rId33"/>
+                    <a:blip r:embed="rId34"/>
                     <a:stretch>
                       <a:fillRect/>
                     </a:stretch>
@@ -1630,8 +1656,8 @@
         <w:t xml:space="preserve">Interactive API documentation</w:t>
       </w:r>
     </w:p>
-    <w:bookmarkEnd w:id="36"/>
-    <w:bookmarkStart w:id="56" w:name="final-demo-screenshots"/>
+    <w:bookmarkEnd w:id="37"/>
+    <w:bookmarkStart w:id="57" w:name="final-demo-screenshots"/>
     <w:p>
       <w:pPr>
         <w:pStyle w:val="Heading1"/>
@@ -1648,7 +1674,7 @@
         <w:t xml:space="preserve">The following screenshots demonstrate the complete OncoReconcile AI enterprise platform workflow.</w:t>
       </w:r>
     </w:p>
-    <w:bookmarkStart w:id="37" w:name="homepage"/>
+    <w:bookmarkStart w:id="38" w:name="homepage"/>
     <w:p>
       <w:pPr>
         <w:pStyle w:val="Heading2"/>
@@ -1674,8 +1700,8 @@
         <w:t xml:space="preserve">Homepage showing the Single Record Reconciliation interface, featured demo, and manual input form.</w:t>
       </w:r>
     </w:p>
-    <w:bookmarkEnd w:id="37"/>
-    <w:bookmarkStart w:id="38" w:name="single-record-reconciliation"/>
+    <w:bookmarkEnd w:id="38"/>
+    <w:bookmarkStart w:id="39" w:name="single-record-reconciliation"/>
     <w:p>
       <w:pPr>
         <w:pStyle w:val="Heading2"/>
@@ -1701,8 +1727,8 @@
         <w:t xml:space="preserve">Evidence-supported reconciliation result showing canonical values, confidence score, evidence sources, and audit trail.</w:t>
       </w:r>
     </w:p>
-    <w:bookmarkEnd w:id="38"/>
-    <w:bookmarkStart w:id="39" w:name="review-required-case"/>
+    <w:bookmarkEnd w:id="39"/>
+    <w:bookmarkStart w:id="40" w:name="review-required-case"/>
     <w:p>
       <w:pPr>
         <w:pStyle w:val="Heading2"/>
@@ -1728,8 +1754,8 @@
         <w:t xml:space="preserve">Cat-VRS-style ambiguity (TRK fusion) preserved for accountable human review.</w:t>
       </w:r>
     </w:p>
-    <w:bookmarkEnd w:id="39"/>
-    <w:bookmarkStart w:id="40" w:name="review-queue"/>
+    <w:bookmarkEnd w:id="40"/>
+    <w:bookmarkStart w:id="41" w:name="review-queue"/>
     <w:p>
       <w:pPr>
         <w:pStyle w:val="Heading2"/>
@@ -1755,8 +1781,8 @@
         <w:t xml:space="preserve">Governed review queue with decision controls, alternatives, evidence, and audit history.</w:t>
       </w:r>
     </w:p>
-    <w:bookmarkEnd w:id="40"/>
-    <w:bookmarkStart w:id="41" w:name="evaluation-dashboard"/>
+    <w:bookmarkEnd w:id="41"/>
+    <w:bookmarkStart w:id="42" w:name="evaluation-dashboard"/>
     <w:p>
       <w:pPr>
         <w:pStyle w:val="Heading2"/>
@@ -1782,8 +1808,8 @@
         <w:t xml:space="preserve">Benchmark validation metrics, accuracy and coverage gauges, failure analysis, and reviewer agreement.</w:t>
       </w:r>
     </w:p>
-    <w:bookmarkEnd w:id="41"/>
-    <w:bookmarkStart w:id="42" w:name="knowledge-graph-export"/>
+    <w:bookmarkEnd w:id="42"/>
+    <w:bookmarkStart w:id="43" w:name="knowledge-graph-export"/>
     <w:p>
       <w:pPr>
         <w:pStyle w:val="Heading2"/>
@@ -1809,8 +1835,8 @@
         <w:t xml:space="preserve">JSON-LD knowledge graph with disease-gene-variant-treatment-evidence relationships.</w:t>
       </w:r>
     </w:p>
-    <w:bookmarkEnd w:id="42"/>
-    <w:bookmarkStart w:id="43" w:name="api-documentation"/>
+    <w:bookmarkEnd w:id="43"/>
+    <w:bookmarkStart w:id="44" w:name="api-documentation"/>
     <w:p>
       <w:pPr>
         <w:pStyle w:val="Heading2"/>
@@ -1836,8 +1862,8 @@
         <w:t xml:space="preserve">FastAPI interactive OpenAPI documentation exposing reconciliation, review, analytics, and export endpoints.</w:t>
       </w:r>
     </w:p>
-    <w:bookmarkEnd w:id="43"/>
-    <w:bookmarkStart w:id="47" w:name="enterprise-patient-journey-1"/>
+    <w:bookmarkEnd w:id="44"/>
+    <w:bookmarkStart w:id="48" w:name="enterprise-patient-journey-1"/>
     <w:p>
       <w:pPr>
         <w:pStyle w:val="Heading2"/>
@@ -1855,18 +1881,18 @@
           <wp:inline>
             <wp:extent cx="5334000" cy="4074583"/>
             <wp:effectExtent b="0" l="0" r="0" t="0"/>
-            <wp:docPr descr="Enterprise patient journey timeline with biomarker and treatment history" title="" id="45" name="Picture"/>
+            <wp:docPr descr="Enterprise patient journey timeline with biomarker and treatment history" title="" id="46" name="Picture"/>
             <a:graphic>
               <a:graphicData uri="http://schemas.openxmlformats.org/drawingml/2006/picture">
                 <pic:pic>
                   <pic:nvPicPr>
-                    <pic:cNvPr descr="screenshots/08-enterprise-patient-journey.png" id="46" name="Picture"/>
+                    <pic:cNvPr descr="screenshots/08-enterprise-patient-journey.png" id="47" name="Picture"/>
                     <pic:cNvPicPr>
                       <a:picLocks noChangeArrowheads="1" noChangeAspect="1"/>
                     </pic:cNvPicPr>
                   </pic:nvPicPr>
                   <pic:blipFill>
-                    <a:blip r:embed="rId44"/>
+                    <a:blip r:embed="rId45"/>
                     <a:stretch>
                       <a:fillRect/>
                     </a:stretch>
@@ -1903,8 +1929,8 @@
         <w:t xml:space="preserve">Longitudinal patient journey view showing diagnosis, biomarkers, copy-number alterations, treatment timeline, review status, and quality indicators.</w:t>
       </w:r>
     </w:p>
-    <w:bookmarkEnd w:id="47"/>
-    <w:bookmarkStart w:id="51" w:name="executive-dashboard"/>
+    <w:bookmarkEnd w:id="48"/>
+    <w:bookmarkStart w:id="52" w:name="executive-dashboard"/>
     <w:p>
       <w:pPr>
         <w:pStyle w:val="Heading2"/>
@@ -1922,18 +1948,18 @@
           <wp:inline>
             <wp:extent cx="5334000" cy="4074583"/>
             <wp:effectExtent b="0" l="0" r="0" t="0"/>
-            <wp:docPr descr="Executive dashboard with platform coverage and readiness metrics" title="" id="49" name="Picture"/>
+            <wp:docPr descr="Executive dashboard with platform coverage and readiness metrics" title="" id="50" name="Picture"/>
             <a:graphic>
               <a:graphicData uri="http://schemas.openxmlformats.org/drawingml/2006/picture">
                 <pic:pic>
                   <pic:nvPicPr>
-                    <pic:cNvPr descr="screenshots/09-executive-dashboard.png" id="50" name="Picture"/>
+                    <pic:cNvPr descr="screenshots/09-executive-dashboard.png" id="51" name="Picture"/>
                     <pic:cNvPicPr>
                       <a:picLocks noChangeArrowheads="1" noChangeAspect="1"/>
                     </pic:cNvPicPr>
                   </pic:nvPicPr>
                   <pic:blipFill>
-                    <a:blip r:embed="rId48"/>
+                    <a:blip r:embed="rId49"/>
                     <a:stretch>
                       <a:fillRect/>
                     </a:stretch>
@@ -1970,8 +1996,8 @@
         <w:t xml:space="preserve">Enterprise dashboard summarizing patients managed, data quality, governance, AI readiness, reconciliation coverage, evidence coverage, and semantic harmonization.</w:t>
       </w:r>
     </w:p>
-    <w:bookmarkEnd w:id="51"/>
-    <w:bookmarkStart w:id="55" w:name="coding-system-alignment"/>
+    <w:bookmarkEnd w:id="52"/>
+    <w:bookmarkStart w:id="56" w:name="coding-system-alignment"/>
     <w:p>
       <w:pPr>
         <w:pStyle w:val="Heading2"/>
@@ -1989,18 +2015,18 @@
           <wp:inline>
             <wp:extent cx="5334000" cy="4074583"/>
             <wp:effectExtent b="0" l="0" r="0" t="0"/>
-            <wp:docPr descr="Coding system alignment dashboard with semantic harmonization mappings" title="" id="53" name="Picture"/>
+            <wp:docPr descr="Coding system alignment dashboard with semantic harmonization mappings" title="" id="54" name="Picture"/>
             <a:graphic>
               <a:graphicData uri="http://schemas.openxmlformats.org/drawingml/2006/picture">
                 <pic:pic>
                   <pic:nvPicPr>
-                    <pic:cNvPr descr="screenshots/10-coding-alignment.png" id="54" name="Picture"/>
+                    <pic:cNvPr descr="screenshots/10-coding-alignment.png" id="55" name="Picture"/>
                     <pic:cNvPicPr>
                       <a:picLocks noChangeArrowheads="1" noChangeAspect="1"/>
                     </pic:cNvPicPr>
                   </pic:nvPicPr>
                   <pic:blipFill>
-                    <a:blip r:embed="rId52"/>
+                    <a:blip r:embed="rId53"/>
                     <a:stretch>
                       <a:fillRect/>
                     </a:stretch>
@@ -2037,9 +2063,9 @@
         <w:t xml:space="preserve">Semantic interoperability dashboard showing coding-system coverage, canonical mappings, terminology examples, and complete mapping coverage.</w:t>
       </w:r>
     </w:p>
-    <w:bookmarkEnd w:id="55"/>
     <w:bookmarkEnd w:id="56"/>
-    <w:bookmarkStart w:id="65" w:name="evidence-retrieval-architecture"/>
+    <w:bookmarkEnd w:id="57"/>
+    <w:bookmarkStart w:id="66" w:name="evidence-retrieval-architecture"/>
     <w:p>
       <w:pPr>
         <w:pStyle w:val="Heading1"/>
@@ -2056,7 +2082,7 @@
         <w:t xml:space="preserve">The current prototype adds curated HGVS resolution, structured ClinVar retrieval, CIViC variant-record search, a unified evidence model, and a separately reported evidence-weight calculation.</w:t>
       </w:r>
     </w:p>
-    <w:bookmarkStart w:id="57" w:name="architecture"/>
+    <w:bookmarkStart w:id="58" w:name="architecture"/>
     <w:p>
       <w:pPr>
         <w:pStyle w:val="Heading2"/>
@@ -2382,8 +2408,8 @@
         <w:t xml:space="preserve">Existing Confidence Score + Separate Evidence Breakdown</w:t>
       </w:r>
     </w:p>
-    <w:bookmarkEnd w:id="57"/>
-    <w:bookmarkStart w:id="58" w:name="canonical-hgvs"/>
+    <w:bookmarkEnd w:id="58"/>
+    <w:bookmarkStart w:id="59" w:name="canonical-hgvs"/>
     <w:p>
       <w:pPr>
         <w:pStyle w:val="Heading2"/>
@@ -2430,8 +2456,8 @@
         <w:t xml:space="preserve">fields as GA4GH VRS placeholders.</w:t>
       </w:r>
     </w:p>
-    <w:bookmarkEnd w:id="58"/>
-    <w:bookmarkStart w:id="59" w:name="clinvar-integration"/>
+    <w:bookmarkEnd w:id="59"/>
+    <w:bookmarkStart w:id="60" w:name="clinvar-integration"/>
     <w:p>
       <w:pPr>
         <w:pStyle w:val="Heading2"/>
@@ -2463,8 +2489,8 @@
         <w:t xml:space="preserve">service queries NCBI ClinVar via E-utilities using HGVS-first strategy with rate-limiting (3 req/s). Retrieves clinical significance, review status, variation ID, accession, and submission count. Confidence is mapped from review status (practice guideline → 0.95, expert panel → 0.90, etc.).</w:t>
       </w:r>
     </w:p>
-    <w:bookmarkEnd w:id="59"/>
-    <w:bookmarkStart w:id="60" w:name="civic-integration"/>
+    <w:bookmarkEnd w:id="60"/>
+    <w:bookmarkStart w:id="61" w:name="civic-integration"/>
     <w:p>
       <w:pPr>
         <w:pStyle w:val="Heading2"/>
@@ -2496,8 +2522,8 @@
         <w:t xml:space="preserve">service queries CIViC via GraphQL variant search and returns variant name, CIViC variant ID, and a direct record URL. Evidence statements, levels, therapies, diseases, and citations are not yet retrieved by the active path.</w:t>
       </w:r>
     </w:p>
-    <w:bookmarkEnd w:id="60"/>
-    <w:bookmarkStart w:id="61" w:name="unified-evidence-model"/>
+    <w:bookmarkEnd w:id="61"/>
+    <w:bookmarkStart w:id="62" w:name="unified-evidence-model"/>
     <w:p>
       <w:pPr>
         <w:pStyle w:val="Heading2"/>
@@ -2514,8 +2540,8 @@
         <w:t xml:space="preserve">Evidence sources share a common schema with deduplication and source grouping for frontend display. A capped evidence-weight value and breakdown are returned separately; they do not currently change the core confidence score or reconciliation routing.</w:t>
       </w:r>
     </w:p>
-    <w:bookmarkEnd w:id="61"/>
-    <w:bookmarkStart w:id="62" w:name="new-api-endpoints"/>
+    <w:bookmarkEnd w:id="62"/>
+    <w:bookmarkStart w:id="63" w:name="new-api-endpoints"/>
     <w:p>
       <w:pPr>
         <w:pStyle w:val="Heading2"/>
@@ -2644,8 +2670,8 @@
         </w:tc>
       </w:tr>
     </w:tbl>
-    <w:bookmarkEnd w:id="62"/>
-    <w:bookmarkStart w:id="63" w:name="future-architecture-design-only"/>
+    <w:bookmarkEnd w:id="63"/>
+    <w:bookmarkStart w:id="64" w:name="future-architecture-design-only"/>
     <w:p>
       <w:pPr>
         <w:pStyle w:val="Heading2"/>
@@ -2683,8 +2709,8 @@
         <w:t xml:space="preserve">), ClinGen Allele Registry, OncoKB, gnomAD, GA4GH Beacon, GA4GH Phenopackets. No implementation has been started.</w:t>
       </w:r>
     </w:p>
-    <w:bookmarkEnd w:id="63"/>
-    <w:bookmarkStart w:id="64" w:name="testing"/>
+    <w:bookmarkEnd w:id="64"/>
+    <w:bookmarkStart w:id="65" w:name="testing"/>
     <w:p>
       <w:pPr>
         <w:pStyle w:val="Heading2"/>
@@ -2698,12 +2724,36 @@
         <w:pStyle w:val="FirstParagraph"/>
       </w:pPr>
       <w:r>
-        <w:t xml:space="preserve">The evidence upgrade is covered by the reconciliation test module. On June 24, 2026, pytest collected 149 backend tests; 146 pass deterministically and 3 live-evidence tests are intentionally skipped when external network services are unavailable.</w:t>
-      </w:r>
-    </w:p>
-    <w:bookmarkEnd w:id="64"/>
+        <w:t xml:space="preserve">The evidence-upgrade functionality is covered by the backend reconciliation test suite. During final project validation, pytest collected 149 backend tests, of which 146 passed deterministically and 3 live-evidence tests were intentionally skipped when external network services were unavailable. A subsequent local verification on July 12, 2026 produced the same backend result: 146 passed; 3 skipped.</w:t>
+      </w:r>
+    </w:p>
+    <w:p>
+      <w:pPr>
+        <w:pStyle w:val="BodyText"/>
+      </w:pPr>
+      <w:r>
+        <w:t xml:space="preserve">The frontend production build also completed successfully.</w:t>
+      </w:r>
+    </w:p>
+    <w:p>
+      <w:pPr>
+        <w:pStyle w:val="BodyText"/>
+      </w:pPr>
+      <w:r>
+        <w:t xml:space="preserve">The evaluation assets include 191 curated API and regression test cases together with a 500-case expanded benchmark dataset used for engineering evaluation. The latest recorded benchmark results achieved 96.6% gene reconciliation accuracy, 94.6% variant reconciliation accuracy, 89.8% safety-aware status accuracy, and a 0% false auto-accept rate.</w:t>
+      </w:r>
+    </w:p>
+    <w:p>
+      <w:pPr>
+        <w:pStyle w:val="BodyText"/>
+      </w:pPr>
+      <w:r>
+        <w:t xml:space="preserve">The benchmark assets are internal engineering evaluation materials, not clinical validation studies.</w:t>
+      </w:r>
+    </w:p>
     <w:bookmarkEnd w:id="65"/>
-    <w:bookmarkStart w:id="69" w:name="validation"/>
+    <w:bookmarkEnd w:id="66"/>
+    <w:bookmarkStart w:id="70" w:name="validation"/>
     <w:p>
       <w:pPr>
         <w:pStyle w:val="Heading1"/>
@@ -2717,7 +2767,7 @@
         <w:pStyle w:val="FirstParagraph"/>
       </w:pPr>
       <w:r>
-        <w:t xml:space="preserve">Reviewed on June 24, 2026:</w:t>
+        <w:t xml:space="preserve">Reviewed on July 12, 2026:</w:t>
       </w:r>
     </w:p>
     <w:tbl>
@@ -2767,7 +2817,7 @@
               <w:pStyle w:val="Compact"/>
             </w:pPr>
             <w:r>
-              <w:t xml:space="preserve">Backend tests</w:t>
+              <w:t xml:space="preserve">Backend test suite</w:t>
             </w:r>
           </w:p>
         </w:tc>
@@ -2779,7 +2829,7 @@
               <w:jc w:val="right"/>
             </w:pPr>
             <w:r>
-              <w:t xml:space="preserve">149 collected; 146 passing; 3 skipped</w:t>
+              <w:t xml:space="preserve">149 tests collected; 146 passed; 3 skipped (live external-evidence tests)</w:t>
             </w:r>
           </w:p>
         </w:tc>
@@ -2817,7 +2867,7 @@
               <w:pStyle w:val="Compact"/>
             </w:pPr>
             <w:r>
-              <w:t xml:space="preserve">Current API/test benchmark</w:t>
+              <w:t xml:space="preserve">Current API &amp; regression benchmark</w:t>
             </w:r>
           </w:p>
         </w:tc>
@@ -2829,7 +2879,7 @@
               <w:jc w:val="right"/>
             </w:pPr>
             <w:r>
-              <w:t xml:space="preserve">191 curated cases</w:t>
+              <w:t xml:space="preserve">191 curated test cases</w:t>
             </w:r>
           </w:p>
         </w:tc>
@@ -2842,7 +2892,7 @@
               <w:pStyle w:val="Compact"/>
             </w:pPr>
             <w:r>
-              <w:t xml:space="preserve">Expanded benchmark dataset</w:t>
+              <w:t xml:space="preserve">Expanded engineering benchmark</w:t>
             </w:r>
           </w:p>
         </w:tc>
@@ -2854,7 +2904,7 @@
               <w:jc w:val="right"/>
             </w:pPr>
             <w:r>
-              <w:t xml:space="preserve">500 cases</w:t>
+              <w:t xml:space="preserve">500 benchmark cases</w:t>
             </w:r>
           </w:p>
         </w:tc>
@@ -2867,7 +2917,7 @@
               <w:pStyle w:val="Compact"/>
             </w:pPr>
             <w:r>
-              <w:t xml:space="preserve">Latest recorded benchmark metrics</w:t>
+              <w:t xml:space="preserve">Gene reconciliation accuracy</w:t>
             </w:r>
           </w:p>
         </w:tc>
@@ -2879,7 +2929,82 @@
               <w:jc w:val="right"/>
             </w:pPr>
             <w:r>
-              <w:t xml:space="preserve">96.6% gene accuracy; 94.6% variant accuracy; 89.8% safety-aware status accuracy; 0% false auto-accept rate</w:t>
+              <w:t xml:space="preserve">96.6%</w:t>
+            </w:r>
+          </w:p>
+        </w:tc>
+      </w:tr>
+      <w:tr>
+        <w:tc>
+          <w:tcPr/>
+          <w:p>
+            <w:pPr>
+              <w:pStyle w:val="Compact"/>
+            </w:pPr>
+            <w:r>
+              <w:t xml:space="preserve">Variant reconciliation accuracy</w:t>
+            </w:r>
+          </w:p>
+        </w:tc>
+        <w:tc>
+          <w:tcPr/>
+          <w:p>
+            <w:pPr>
+              <w:pStyle w:val="Compact"/>
+              <w:jc w:val="right"/>
+            </w:pPr>
+            <w:r>
+              <w:t xml:space="preserve">94.6%</w:t>
+            </w:r>
+          </w:p>
+        </w:tc>
+      </w:tr>
+      <w:tr>
+        <w:tc>
+          <w:tcPr/>
+          <w:p>
+            <w:pPr>
+              <w:pStyle w:val="Compact"/>
+            </w:pPr>
+            <w:r>
+              <w:t xml:space="preserve">Safety-aware status accuracy</w:t>
+            </w:r>
+          </w:p>
+        </w:tc>
+        <w:tc>
+          <w:tcPr/>
+          <w:p>
+            <w:pPr>
+              <w:pStyle w:val="Compact"/>
+              <w:jc w:val="right"/>
+            </w:pPr>
+            <w:r>
+              <w:t xml:space="preserve">89.8%</w:t>
+            </w:r>
+          </w:p>
+        </w:tc>
+      </w:tr>
+      <w:tr>
+        <w:tc>
+          <w:tcPr/>
+          <w:p>
+            <w:pPr>
+              <w:pStyle w:val="Compact"/>
+            </w:pPr>
+            <w:r>
+              <w:t xml:space="preserve">False auto-accept rate</w:t>
+            </w:r>
+          </w:p>
+        </w:tc>
+        <w:tc>
+          <w:tcPr/>
+          <w:p>
+            <w:pPr>
+              <w:pStyle w:val="Compact"/>
+              <w:jc w:val="right"/>
+            </w:pPr>
+            <w:r>
+              <w:t xml:space="preserve">0%</w:t>
             </w:r>
           </w:p>
         </w:tc>
@@ -2890,7 +3015,7 @@
         <w:pStyle w:val="BodyText"/>
       </w:pPr>
       <w:r>
-        <w:t xml:space="preserve">The benchmark assets are internal engineering evaluation materials, not clinical validation studies.</w:t>
+        <w:t xml:space="preserve">Note: The benchmark assets are intended for internal engineering evaluation and software quality assessment. They are not clinical validation studies or measures of clinical performance.</w:t>
       </w:r>
     </w:p>
     <w:p>
@@ -2902,18 +3027,18 @@
           <wp:inline>
             <wp:extent cx="5334000" cy="3704166"/>
             <wp:effectExtent b="0" l="0" r="0" t="0"/>
-            <wp:docPr descr="Benchmark and safety evaluation dashboard" title="" id="67" name="Picture"/>
+            <wp:docPr descr="Benchmark and safety evaluation dashboard" title="" id="68" name="Picture"/>
             <a:graphic>
               <a:graphicData uri="http://schemas.openxmlformats.org/drawingml/2006/picture">
                 <pic:pic>
                   <pic:nvPicPr>
-                    <pic:cNvPr descr="screenshots/05-evaluation-dashboard.png" id="68" name="Picture"/>
+                    <pic:cNvPr descr="screenshots/05-evaluation-dashboard.png" id="69" name="Picture"/>
                     <pic:cNvPicPr>
                       <a:picLocks noChangeArrowheads="1" noChangeAspect="1"/>
                     </pic:cNvPicPr>
                   </pic:nvPicPr>
                   <pic:blipFill>
-                    <a:blip r:embed="rId66"/>
+                    <a:blip r:embed="rId67"/>
                     <a:stretch>
                       <a:fillRect/>
                     </a:stretch>
@@ -2948,8 +3073,8 @@
         <w:t xml:space="preserve">Benchmark and safety evaluation dashboard</w:t>
       </w:r>
     </w:p>
-    <w:bookmarkEnd w:id="69"/>
-    <w:bookmarkStart w:id="70" w:name="customer-pain-points"/>
+    <w:bookmarkEnd w:id="70"/>
+    <w:bookmarkStart w:id="71" w:name="customer-pain-points"/>
     <w:p>
       <w:pPr>
         <w:pStyle w:val="Heading1"/>
@@ -3245,8 +3370,8 @@
         <w:t xml:space="preserve">organizations spend expert time on data plumbing instead of science, and every project starts from scratch.</w:t>
       </w:r>
     </w:p>
-    <w:bookmarkEnd w:id="70"/>
-    <w:bookmarkStart w:id="71" w:name="customer-personas"/>
+    <w:bookmarkEnd w:id="71"/>
+    <w:bookmarkStart w:id="72" w:name="customer-personas"/>
     <w:p>
       <w:pPr>
         <w:pStyle w:val="Heading1"/>
@@ -3540,8 +3665,8 @@
         </w:tc>
       </w:tr>
     </w:tbl>
-    <w:bookmarkEnd w:id="71"/>
-    <w:bookmarkStart w:id="74" w:name="business-model"/>
+    <w:bookmarkEnd w:id="72"/>
+    <w:bookmarkStart w:id="75" w:name="business-model"/>
     <w:p>
       <w:pPr>
         <w:pStyle w:val="Heading1"/>
@@ -3796,7 +3921,7 @@
         </w:tc>
       </w:tr>
     </w:tbl>
-    <w:bookmarkStart w:id="72" w:name="go-to-market-strategy"/>
+    <w:bookmarkStart w:id="73" w:name="go-to-market-strategy"/>
     <w:p>
       <w:pPr>
         <w:pStyle w:val="Heading2"/>
@@ -3871,8 +3996,8 @@
         <w:t xml:space="preserve">— enterprise customers integrate OncoReconcile capabilities into their own platforms, creating recurring API revenue.</w:t>
       </w:r>
     </w:p>
-    <w:bookmarkEnd w:id="72"/>
-    <w:bookmarkStart w:id="73" w:name="roi-framework"/>
+    <w:bookmarkEnd w:id="73"/>
+    <w:bookmarkStart w:id="74" w:name="roi-framework"/>
     <w:p>
       <w:pPr>
         <w:pStyle w:val="Heading2"/>
@@ -4096,9 +4221,9 @@
         </w:tc>
       </w:tr>
     </w:tbl>
-    <w:bookmarkEnd w:id="73"/>
     <w:bookmarkEnd w:id="74"/>
-    <w:bookmarkStart w:id="77" w:name="competitive-differentiation"/>
+    <w:bookmarkEnd w:id="75"/>
+    <w:bookmarkStart w:id="78" w:name="competitive-differentiation"/>
     <w:p>
       <w:pPr>
         <w:pStyle w:val="Heading1"/>
@@ -4107,7 +4232,7 @@
         <w:t xml:space="preserve">Competitive Differentiation</w:t>
       </w:r>
     </w:p>
-    <w:bookmarkStart w:id="75" w:name="how-oncoreconcile-ai-compares"/>
+    <w:bookmarkStart w:id="76" w:name="how-oncoreconcile-ai-compares"/>
     <w:p>
       <w:pPr>
         <w:pStyle w:val="Heading2"/>
@@ -5068,8 +5193,8 @@
         <w:t xml:space="preserve">OncoReconcile AI combines all of these capabilities in an oncology-specific, governance-first platform. It is not a terminology tool, not a knowledgebase, and not a generic AI — it is a governed data-quality layer for precision oncology.</w:t>
       </w:r>
     </w:p>
-    <w:bookmarkEnd w:id="75"/>
-    <w:bookmarkStart w:id="76" w:name="why-this-combination-matters"/>
+    <w:bookmarkEnd w:id="76"/>
+    <w:bookmarkStart w:id="77" w:name="why-this-combination-matters"/>
     <w:p>
       <w:pPr>
         <w:pStyle w:val="Heading2"/>
@@ -5166,9 +5291,9 @@
         <w:t xml:space="preserve">provides deterministic reconciliation where possible, evidence-supported review where needed, and human governance everywhere.</w:t>
       </w:r>
     </w:p>
-    <w:bookmarkEnd w:id="76"/>
     <w:bookmarkEnd w:id="77"/>
-    <w:bookmarkStart w:id="78" w:name="social-impact"/>
+    <w:bookmarkEnd w:id="78"/>
+    <w:bookmarkStart w:id="79" w:name="social-impact"/>
     <w:p>
       <w:pPr>
         <w:pStyle w:val="Heading1"/>
@@ -5392,8 +5517,8 @@
         <w:t xml:space="preserve">OncoReconcile AI is a data-quality and governance platform. It does not make clinical decisions, provide treatment recommendations, or replace clinical judgment. Its impact is enabling better, more trustworthy data — which is a prerequisite for safer AI and more reliable research in precision oncology.</w:t>
       </w:r>
     </w:p>
-    <w:bookmarkEnd w:id="78"/>
-    <w:bookmarkStart w:id="79" w:name="team"/>
+    <w:bookmarkEnd w:id="79"/>
+    <w:bookmarkStart w:id="80" w:name="team"/>
     <w:p>
       <w:pPr>
         <w:pStyle w:val="Heading1"/>
@@ -5418,8 +5543,8 @@
         <w:t xml:space="preserve">The team’s core insight is simple: oncology organizations do not only need a model that produces an answer. They need a data-quality platform that can explain the answer, preserve uncertainty, route difficult cases to experts, and integrate governed results across the enterprise.</w:t>
       </w:r>
     </w:p>
-    <w:bookmarkEnd w:id="79"/>
-    <w:bookmarkStart w:id="80" w:name="roadmap"/>
+    <w:bookmarkEnd w:id="80"/>
+    <w:bookmarkStart w:id="81" w:name="roadmap"/>
     <w:p>
       <w:pPr>
         <w:pStyle w:val="Heading1"/>
@@ -5500,8 +5625,8 @@
         <w:t xml:space="preserve">scale into a customer-controlled oncology data-quality platform.</w:t>
       </w:r>
     </w:p>
-    <w:bookmarkEnd w:id="80"/>
-    <w:bookmarkStart w:id="85" w:name="standards-alignment-reference-resources"/>
+    <w:bookmarkEnd w:id="81"/>
+    <w:bookmarkStart w:id="86" w:name="standards-alignment-reference-resources"/>
     <w:p>
       <w:pPr>
         <w:pStyle w:val="Heading1"/>
@@ -5518,7 +5643,7 @@
         <w:t xml:space="preserve">OncoReconcile AI is designed to align with widely adopted healthcare interoperability, precision oncology, and biomedical knowledge standards. These resources inform the platform’s semantic harmonization, governance, interoperability, and future expansion roadmap.</w:t>
       </w:r>
     </w:p>
-    <w:bookmarkStart w:id="81" w:name="healthcare-interoperability"/>
+    <w:bookmarkStart w:id="82" w:name="healthcare-interoperability"/>
     <w:p>
       <w:pPr>
         <w:pStyle w:val="Heading2"/>
@@ -5599,8 +5724,8 @@
         <w:t xml:space="preserve">ICD-10-CM</w:t>
       </w:r>
     </w:p>
-    <w:bookmarkEnd w:id="81"/>
-    <w:bookmarkStart w:id="82" w:name="precision-oncology-genomics-standards"/>
+    <w:bookmarkEnd w:id="82"/>
+    <w:bookmarkStart w:id="83" w:name="precision-oncology-genomics-standards"/>
     <w:p>
       <w:pPr>
         <w:pStyle w:val="Heading2"/>
@@ -5705,8 +5830,8 @@
         <w:t xml:space="preserve">OncoTree</w:t>
       </w:r>
     </w:p>
-    <w:bookmarkEnd w:id="82"/>
-    <w:bookmarkStart w:id="83" w:name="biomedical-knowledge-sources"/>
+    <w:bookmarkEnd w:id="83"/>
+    <w:bookmarkStart w:id="84" w:name="biomedical-knowledge-sources"/>
     <w:p>
       <w:pPr>
         <w:pStyle w:val="Heading2"/>
@@ -5787,8 +5912,8 @@
         <w:t xml:space="preserve">National Center for Biotechnology Information (NCBI)</w:t>
       </w:r>
     </w:p>
-    <w:bookmarkEnd w:id="83"/>
-    <w:bookmarkStart w:id="84" w:name="platform-positioning"/>
+    <w:bookmarkEnd w:id="84"/>
+    <w:bookmarkStart w:id="85" w:name="platform-positioning"/>
     <w:p>
       <w:pPr>
         <w:pStyle w:val="Heading2"/>
@@ -5813,9 +5938,9 @@
         <w:t xml:space="preserve">Current implementation includes selected interoperability and terminology concepts. Additional standards integration remains part of the future product roadmap.</w:t>
       </w:r>
     </w:p>
-    <w:bookmarkEnd w:id="84"/>
     <w:bookmarkEnd w:id="85"/>
-    <w:bookmarkStart w:id="99" w:name="repository-resources"/>
+    <w:bookmarkEnd w:id="86"/>
+    <w:bookmarkStart w:id="103" w:name="repository-resources"/>
     <w:p>
       <w:pPr>
         <w:pStyle w:val="Heading1"/>
@@ -5824,7 +5949,7 @@
         <w:t xml:space="preserve">Repository Resources</w:t>
       </w:r>
     </w:p>
-    <w:bookmarkStart w:id="86" w:name="primary-repository"/>
+    <w:bookmarkStart w:id="87" w:name="primary-repository"/>
     <w:p>
       <w:pPr>
         <w:pStyle w:val="Heading2"/>
@@ -5841,8 +5966,8 @@
         <w:t xml:space="preserve">https://github.com/oncoreconcile-ai/oncoreconcile-ai</w:t>
       </w:r>
     </w:p>
-    <w:bookmarkEnd w:id="86"/>
-    <w:bookmarkStart w:id="87" w:name="submission-branch"/>
+    <w:bookmarkEnd w:id="87"/>
+    <w:bookmarkStart w:id="88" w:name="submission-branch"/>
     <w:p>
       <w:pPr>
         <w:pStyle w:val="Heading2"/>
@@ -5859,8 +5984,8 @@
         <w:t xml:space="preserve">https://github.com/oncoreconcile-ai/oncoreconcile-ai/tree/enterprise-patient-journey-demo</w:t>
       </w:r>
     </w:p>
-    <w:bookmarkEnd w:id="87"/>
-    <w:bookmarkStart w:id="97" w:name="key-documentation"/>
+    <w:bookmarkEnd w:id="88"/>
+    <w:bookmarkStart w:id="98" w:name="key-documentation"/>
     <w:p>
       <w:pPr>
         <w:pStyle w:val="Heading2"/>
@@ -5877,7 +6002,7 @@
           <w:numId w:val="1011"/>
         </w:numPr>
       </w:pPr>
-      <w:hyperlink r:id="rId88">
+      <w:hyperlink r:id="rId89">
         <w:r>
           <w:rPr>
             <w:rStyle w:val="Hyperlink"/>
@@ -5894,7 +6019,7 @@
           <w:numId w:val="1011"/>
         </w:numPr>
       </w:pPr>
-      <w:hyperlink r:id="rId89">
+      <w:hyperlink r:id="rId90">
         <w:r>
           <w:rPr>
             <w:rStyle w:val="Hyperlink"/>
@@ -5911,7 +6036,7 @@
           <w:numId w:val="1011"/>
         </w:numPr>
       </w:pPr>
-      <w:hyperlink r:id="rId90">
+      <w:hyperlink r:id="rId91">
         <w:r>
           <w:rPr>
             <w:rStyle w:val="Hyperlink"/>
@@ -5928,7 +6053,7 @@
           <w:numId w:val="1011"/>
         </w:numPr>
       </w:pPr>
-      <w:hyperlink r:id="rId91">
+      <w:hyperlink r:id="rId92">
         <w:r>
           <w:rPr>
             <w:rStyle w:val="Hyperlink"/>
@@ -5945,7 +6070,7 @@
           <w:numId w:val="1011"/>
         </w:numPr>
       </w:pPr>
-      <w:hyperlink r:id="rId92">
+      <w:hyperlink r:id="rId93">
         <w:r>
           <w:rPr>
             <w:rStyle w:val="Hyperlink"/>
@@ -5962,7 +6087,7 @@
           <w:numId w:val="1011"/>
         </w:numPr>
       </w:pPr>
-      <w:hyperlink r:id="rId93">
+      <w:hyperlink r:id="rId94">
         <w:r>
           <w:rPr>
             <w:rStyle w:val="Hyperlink"/>
@@ -5979,7 +6104,7 @@
           <w:numId w:val="1011"/>
         </w:numPr>
       </w:pPr>
-      <w:hyperlink r:id="rId94">
+      <w:hyperlink r:id="rId95">
         <w:r>
           <w:rPr>
             <w:rStyle w:val="Hyperlink"/>
@@ -5996,7 +6121,7 @@
           <w:numId w:val="1011"/>
         </w:numPr>
       </w:pPr>
-      <w:hyperlink r:id="rId95">
+      <w:hyperlink r:id="rId96">
         <w:r>
           <w:rPr>
             <w:rStyle w:val="Hyperlink"/>
@@ -6013,7 +6138,7 @@
           <w:numId w:val="1011"/>
         </w:numPr>
       </w:pPr>
-      <w:hyperlink r:id="rId96">
+      <w:hyperlink r:id="rId97">
         <w:r>
           <w:rPr>
             <w:rStyle w:val="Hyperlink"/>
@@ -6022,8 +6147,8 @@
         </w:r>
       </w:hyperlink>
     </w:p>
-    <w:bookmarkEnd w:id="97"/>
-    <w:bookmarkStart w:id="98" w:name="supporting-assets"/>
+    <w:bookmarkEnd w:id="98"/>
+    <w:bookmarkStart w:id="102" w:name="supporting-assets"/>
     <w:p>
       <w:pPr>
         <w:pStyle w:val="Heading2"/>
@@ -6041,7 +6166,7 @@
         </w:numPr>
       </w:pPr>
       <w:r>
-        <w:t xml:space="preserve">Benchmark Evaluation Framework</w:t>
+        <w:t xml:space="preserve">Enterprise Analytics Dashboard: executive dashboard demonstrating harmonization KPIs, governance metrics, evidence distribution, and operational analytics.</w:t>
       </w:r>
     </w:p>
     <w:p>
@@ -6053,7 +6178,7 @@
         </w:numPr>
       </w:pPr>
       <w:r>
-        <w:t xml:space="preserve">Review Queue Governance Workflow</w:t>
+        <w:t xml:space="preserve">Benchmark Evaluation Framework: curated benchmark dataset and validation methodology for evaluating reconciliation accuracy and governance workflows.</w:t>
       </w:r>
     </w:p>
     <w:p>
@@ -6065,7 +6190,7 @@
         </w:numPr>
       </w:pPr>
       <w:r>
-        <w:t xml:space="preserve">FHIR Export Prototype</w:t>
+        <w:t xml:space="preserve">Review Queue Governance Workflow: human review workflow supporting reviewer agreement metrics, Cohen’s Kappa, adjudication, audit trail, and governed curation.</w:t>
       </w:r>
     </w:p>
     <w:p>
@@ -6077,7 +6202,7 @@
         </w:numPr>
       </w:pPr>
       <w:r>
-        <w:t xml:space="preserve">OMOP Export Prototype</w:t>
+        <w:t xml:space="preserve">Knowledge Graph Export Prototype: JSON-LD prototype illustrating canonical disease, gene, variant, evidence, provenance, and relationship modeling.</w:t>
       </w:r>
     </w:p>
     <w:p>
@@ -6088,9 +6213,14 @@
           <w:numId w:val="1012"/>
         </w:numPr>
       </w:pPr>
-      <w:r>
-        <w:t xml:space="preserve">Knowledge Graph Export Prototype</w:t>
-      </w:r>
+      <w:hyperlink r:id="rId99">
+        <w:r>
+          <w:rPr>
+            <w:rStyle w:val="Hyperlink"/>
+          </w:rPr>
+          <w:t xml:space="preserve">Prepared FHIR Demo Export</w:t>
+        </w:r>
+      </w:hyperlink>
     </w:p>
     <w:p>
       <w:pPr>
@@ -6100,13 +6230,35 @@
           <w:numId w:val="1012"/>
         </w:numPr>
       </w:pPr>
-      <w:r>
-        <w:t xml:space="preserve">Enterprise Analytics Dashboard</w:t>
-      </w:r>
-    </w:p>
-    <w:bookmarkEnd w:id="98"/>
-    <w:bookmarkEnd w:id="99"/>
-    <w:bookmarkStart w:id="100" w:name="links"/>
+      <w:hyperlink r:id="rId100">
+        <w:r>
+          <w:rPr>
+            <w:rStyle w:val="Hyperlink"/>
+          </w:rPr>
+          <w:t xml:space="preserve">Prepared OMOP Demo Export</w:t>
+        </w:r>
+      </w:hyperlink>
+    </w:p>
+    <w:p>
+      <w:pPr>
+        <w:pStyle w:val="Compact"/>
+        <w:numPr>
+          <w:ilvl w:val="0"/>
+          <w:numId w:val="1012"/>
+        </w:numPr>
+      </w:pPr>
+      <w:hyperlink r:id="rId101">
+        <w:r>
+          <w:rPr>
+            <w:rStyle w:val="Hyperlink"/>
+          </w:rPr>
+          <w:t xml:space="preserve">Demo Export Documentation</w:t>
+        </w:r>
+      </w:hyperlink>
+    </w:p>
+    <w:bookmarkEnd w:id="102"/>
+    <w:bookmarkEnd w:id="103"/>
+    <w:bookmarkStart w:id="104" w:name="links"/>
     <w:p>
       <w:pPr>
         <w:pStyle w:val="Heading1"/>
@@ -6148,7 +6300,7 @@
         <w:br/>
       </w:r>
       <w:r>
-        <w:t xml:space="preserve">https://github.com/oncoreconcile-ai/oncoreconcile-ai/blob/enterprise-patient-journey-demo/docs/DFWIT_Final_Submission.md</w:t>
+        <w:t xml:space="preserve">https://docs.google.com/document/d/1SbL5lo-suS56S8TtRIwaH1IyHVYw3yaIVhLhYaURaQI/edit?tab=t.0</w:t>
       </w:r>
     </w:p>
     <w:p>
@@ -6205,8 +6357,8 @@
         <w:t xml:space="preserve">https://ai.dfwit.org/Rules</w:t>
       </w:r>
     </w:p>
-    <w:bookmarkEnd w:id="100"/>
-    <w:bookmarkStart w:id="101" w:name="disclaimer"/>
+    <w:bookmarkEnd w:id="104"/>
+    <w:bookmarkStart w:id="105" w:name="disclaimer"/>
     <w:p>
       <w:pPr>
         <w:pStyle w:val="Heading1"/>
@@ -6231,8 +6383,8 @@
         <w:t xml:space="preserve">FHIR, OMOP, terminology, and knowledge-graph capabilities are prototypes requiring implementation-specific validation before production use. The enterprise patient journey uses entirely synthetic data; no real patient data is included.</w:t>
       </w:r>
     </w:p>
-    <w:bookmarkEnd w:id="101"/>
-    <w:bookmarkStart w:id="106" w:name="appendix-a-standards-reference-resources"/>
+    <w:bookmarkEnd w:id="105"/>
+    <w:bookmarkStart w:id="110" w:name="appendix-a-standards-reference-resources"/>
     <w:p>
       <w:pPr>
         <w:pStyle w:val="Heading1"/>
@@ -6249,7 +6401,7 @@
         <w:t xml:space="preserve">OncoReconcile AI is designed to work alongside widely adopted healthcare interoperability, precision oncology, terminology, and biomedical knowledge resources.</w:t>
       </w:r>
     </w:p>
-    <w:bookmarkStart w:id="102" w:name="healthcare-interoperability-1"/>
+    <w:bookmarkStart w:id="106" w:name="healthcare-interoperability-1"/>
     <w:p>
       <w:pPr>
         <w:pStyle w:val="Heading2"/>
@@ -6330,8 +6482,8 @@
         <w:t xml:space="preserve">ICD-10-CM</w:t>
       </w:r>
     </w:p>
-    <w:bookmarkEnd w:id="102"/>
-    <w:bookmarkStart w:id="103" w:name="precision-oncology-genomics-standards-1"/>
+    <w:bookmarkEnd w:id="106"/>
+    <w:bookmarkStart w:id="107" w:name="precision-oncology-genomics-standards-1"/>
     <w:p>
       <w:pPr>
         <w:pStyle w:val="Heading2"/>
@@ -6436,8 +6588,8 @@
         <w:t xml:space="preserve">OncoTree</w:t>
       </w:r>
     </w:p>
-    <w:bookmarkEnd w:id="103"/>
-    <w:bookmarkStart w:id="104" w:name="biomedical-knowledge-sources-1"/>
+    <w:bookmarkEnd w:id="107"/>
+    <w:bookmarkStart w:id="108" w:name="biomedical-knowledge-sources-1"/>
     <w:p>
       <w:pPr>
         <w:pStyle w:val="Heading2"/>
@@ -6518,8 +6670,8 @@
         <w:t xml:space="preserve">National Center for Biotechnology Information (NCBI)</w:t>
       </w:r>
     </w:p>
-    <w:bookmarkEnd w:id="104"/>
-    <w:bookmarkStart w:id="105" w:name="enterprise-positioning"/>
+    <w:bookmarkEnd w:id="108"/>
+    <w:bookmarkStart w:id="109" w:name="enterprise-positioning"/>
     <w:p>
       <w:pPr>
         <w:pStyle w:val="Heading2"/>
@@ -6544,8 +6696,8 @@
         <w:t xml:space="preserve">Current implementation demonstrates selected terminology and interoperability concepts. Broader standards integration and conformance testing remain part of the product roadmap.</w:t>
       </w:r>
     </w:p>
-    <w:bookmarkEnd w:id="105"/>
-    <w:bookmarkEnd w:id="106"/>
+    <w:bookmarkEnd w:id="109"/>
+    <w:bookmarkEnd w:id="110"/>
     <w:sectPr>
       <w:footnotePr>
         <w:numRestart w:val="eachSect"/>

</xml_diff>